<commit_message>
Update Background_20250722.docx for vectorbase initial setup
</commit_message>
<xml_diff>
--- a/docs/Background_20250722.docx
+++ b/docs/Background_20250722.docx
@@ -1877,39 +1877,27 @@
           <w14:ligatures w14:val="none"/>
         </w:rPr>
         <w:lastRenderedPageBreak/>
-        <w:t xml:space="preserve">transformation, and uploading of datasets across cities in </w:t>
-      </w:r>
-      <w:proofErr w:type="spellStart"/>
-      <w:r>
-        <w:rPr>
-          <w:rFonts w:ascii="Times New Roman" w:eastAsia="Times New Roman" w:hAnsi="Times New Roman" w:cs="Times New Roman"/>
-          <w:kern w:val="0"/>
-          <w:sz w:val="22"/>
-          <w:szCs w:val="22"/>
-          <w14:ligatures w14:val="none"/>
-        </w:rPr>
-        <w:t>England.</w:t>
-      </w:r>
-      <w:r>
-        <w:rPr>
-          <w:rFonts w:ascii="Times New Roman" w:eastAsia="Times New Roman" w:hAnsi="Times New Roman" w:cs="Times New Roman"/>
-          <w:kern w:val="0"/>
-          <w:sz w:val="22"/>
-          <w:szCs w:val="22"/>
-          <w14:ligatures w14:val="none"/>
-        </w:rPr>
-        <w:t>The</w:t>
-      </w:r>
-      <w:proofErr w:type="spellEnd"/>
-      <w:r>
-        <w:rPr>
-          <w:rFonts w:ascii="Times New Roman" w:eastAsia="Times New Roman" w:hAnsi="Times New Roman" w:cs="Times New Roman"/>
-          <w:kern w:val="0"/>
-          <w:sz w:val="22"/>
-          <w:szCs w:val="22"/>
-          <w14:ligatures w14:val="none"/>
-        </w:rPr>
-        <w:t xml:space="preserve"> architecture supported agentic workflows, with modular LLM agents managing data extraction, validation, and summarisation tasks.</w:t>
+        <w:t>transformation, and uploading of datasets across cities in England.</w:t>
+      </w:r>
+      <w:r>
+        <w:rPr>
+          <w:rFonts w:ascii="Times New Roman" w:eastAsia="Times New Roman" w:hAnsi="Times New Roman" w:cs="Times New Roman"/>
+          <w:kern w:val="0"/>
+          <w:sz w:val="22"/>
+          <w:szCs w:val="22"/>
+          <w14:ligatures w14:val="none"/>
+        </w:rPr>
+        <w:t xml:space="preserve"> </w:t>
+      </w:r>
+      <w:r>
+        <w:rPr>
+          <w:rFonts w:ascii="Times New Roman" w:eastAsia="Times New Roman" w:hAnsi="Times New Roman" w:cs="Times New Roman"/>
+          <w:kern w:val="0"/>
+          <w:sz w:val="22"/>
+          <w:szCs w:val="22"/>
+          <w14:ligatures w14:val="none"/>
+        </w:rPr>
+        <w:t>The architecture supported agentic workflows, with modular LLM agents managing data extraction, validation, and summarisation tasks.</w:t>
       </w:r>
     </w:p>
     <w:p>

</xml_diff>